<commit_message>
Document REB #8 session-reset measure in the REB aid
Add the automatic session-clearing measure (flush-on-finish and
idle-timeout reset with notice modals, from the REB #8 work already on
this branch) to the ethical-measures section, so the aid reflects the
current application.

Co-Authored-By: Claude Opus 4.8 <noreply@anthropic.com>
Claude-Session: https://claude.ai/code/session_01FBXgEU5AReg5YM9uZ92BXe
</commit_message>
<xml_diff>
--- a/REB_Application_Aid_3DBodyMap.docx
+++ b/REB_Application_Aid_3DBodyMap.docx
@@ -1763,6 +1763,34 @@
           <w:szCs w:val="21"/>
         </w:rPr>
         <w:t xml:space="preserve"> Because there is no server copy, the participant physically holds the only copy of their responses (the downloaded file). This supports data control and makes withdrawal straightforward.</w:t>
+      </w:r>
+    </w:p>
+    <w:p>
+      <w:pPr>
+        <w:pStyle w:val="ListParagraph"/>
+        <w:numPr>
+          <w:ilvl w:val="0"/>
+          <w:numId w:val="3"/>
+        </w:numPr>
+        <w:spacing w:after="90" w:line="272"/>
+      </w:pPr>
+      <w:r>
+        <w:rPr>
+          <w:b/>
+          <w:bCs/>
+          <w:color w:val="222222"/>
+          <w:sz w:val="21"/>
+          <w:szCs w:val="21"/>
+        </w:rPr>
+        <w:t xml:space="preserve">Automatic session clearing (shared-device protection).</w:t>
+      </w:r>
+      <w:r>
+        <w:rPr>
+          <w:color w:val="222222"/>
+          <w:sz w:val="21"/>
+          <w:szCs w:val="21"/>
+        </w:rPr>
+        <w:t xml:space="preserve"> To prevent one participant’s data from lingering on a shared device, the application clears the session from memory — the drawings, questionnaire answers, and the prepared response file — and returns to a fresh start page in two cases: when the participant finishes (after they have saved their file), and after a period of inactivity. An inactivity watchdog (by default, 10 minutes idle, then a 60-second “Are you still there?” warning that the participant can dismiss with “Continue session”) resets an abandoned session so the next person on the same device does not see the previous participant’s responses. The reset is never silent — the participant is shown a brief “Assessment complete” or “Session reset” notice. The idle thresholds are configurable for the study.</w:t>
       </w:r>
     </w:p>
     <w:p>

</xml_diff>